<commit_message>
Auto push at 15:16:56
</commit_message>
<xml_diff>
--- a/Semester 7/VLSI/sample paper/2102024.docx
+++ b/Semester 7/VLSI/sample paper/2102024.docx
@@ -2767,9 +2767,8 @@
       <w:szCs w:val="20"/>
     </w:rPr>
   </w:style>
-  <w:style w:type="character" w:styleId="FootnoteCharactersuser">
-    <w:name w:val="Footnote Characters (user)"/>
-    <w:basedOn w:val="DefaultParagraphFont"/>
+  <w:style w:type="character" w:styleId="FootnoteCharacters">
+    <w:name w:val="Footnote Characters"/>
     <w:uiPriority w:val="99"/>
     <w:semiHidden/>
     <w:unhideWhenUsed/>
@@ -2778,8 +2777,8 @@
       <w:vertAlign w:val="superscript"/>
     </w:rPr>
   </w:style>
-  <w:style w:type="character" w:styleId="FootnoteCharacters">
-    <w:name w:val="Footnote Characters"/>
+  <w:style w:type="character" w:styleId="FootnoteCharactersuser">
+    <w:name w:val="Footnote Characters (user)"/>
     <w:qFormat/>
     <w:rPr>
       <w:vertAlign w:val="superscript"/>
@@ -2803,9 +2802,8 @@
       <w:szCs w:val="20"/>
     </w:rPr>
   </w:style>
-  <w:style w:type="character" w:styleId="EndnoteCharactersuser">
-    <w:name w:val="Endnote Characters (user)"/>
-    <w:basedOn w:val="DefaultParagraphFont"/>
+  <w:style w:type="character" w:styleId="EndnoteCharacters">
+    <w:name w:val="Endnote Characters"/>
     <w:uiPriority w:val="99"/>
     <w:semiHidden/>
     <w:unhideWhenUsed/>
@@ -2814,8 +2812,8 @@
       <w:vertAlign w:val="superscript"/>
     </w:rPr>
   </w:style>
-  <w:style w:type="character" w:styleId="EndnoteCharacters">
-    <w:name w:val="Endnote Characters"/>
+  <w:style w:type="character" w:styleId="EndnoteCharactersuser">
+    <w:name w:val="Endnote Characters (user)"/>
     <w:qFormat/>
     <w:rPr>
       <w:vertAlign w:val="superscript"/>

</xml_diff>